<commit_message>
Arduino Code compatible with our project is uploaded. need to make changes in the motor control function
</commit_message>
<xml_diff>
--- a/Proposal.docx
+++ b/Proposal.docx
@@ -192,8 +192,19 @@
           <w:sz w:val="28"/>
           <w:szCs w:val="28"/>
         </w:rPr>
-        <w:t>Submitted to – Hamzeh Alzu'bi</w:t>
-      </w:r>
+        <w:t xml:space="preserve">Submitted to – Hamzeh </w:t>
+      </w:r>
+      <w:proofErr w:type="spellStart"/>
+      <w:r>
+        <w:rPr>
+          <w:rFonts w:ascii="Times New Roman" w:eastAsia="Times New Roman" w:hAnsi="Times New Roman" w:cs="Times New Roman"/>
+          <w:b/>
+          <w:sz w:val="28"/>
+          <w:szCs w:val="28"/>
+        </w:rPr>
+        <w:t>Alzu'bi</w:t>
+      </w:r>
+      <w:proofErr w:type="spellEnd"/>
     </w:p>
     <w:p>
       <w:pPr>
@@ -370,21 +381,19 @@
     </w:p>
     <w:sdt>
       <w:sdtPr>
+        <w:rPr>
+          <w:rFonts w:ascii="Calibri" w:hAnsi="Calibri" w:cs="Calibri"/>
+          <w:b w:val="0"/>
+          <w:bCs w:val="0"/>
+          <w:sz w:val="22"/>
+          <w:szCs w:val="22"/>
+        </w:rPr>
         <w:id w:val="388542449"/>
         <w:docPartObj>
           <w:docPartGallery w:val="Table of Contents"/>
           <w:docPartUnique/>
         </w:docPartObj>
       </w:sdtPr>
-      <w:sdtEndPr>
-        <w:rPr>
-          <w:rFonts w:ascii="Calibri" w:hAnsi="Calibri" w:cs="Calibri"/>
-          <w:b w:val="0"/>
-          <w:bCs w:val="0"/>
-          <w:sz w:val="22"/>
-          <w:szCs w:val="22"/>
-        </w:rPr>
-      </w:sdtEndPr>
       <w:sdtContent>
         <w:p>
           <w:pPr>
@@ -3081,7 +3090,27 @@
           <w:sz w:val="18"/>
           <w:szCs w:val="18"/>
         </w:rPr>
-        <w:t>Figure 1:Standard Self Balancing Robot (Example)</w:t>
+        <w:t xml:space="preserve">Figure </w:t>
+      </w:r>
+      <w:proofErr w:type="gramStart"/>
+      <w:r>
+        <w:rPr>
+          <w:rFonts w:ascii="Times New Roman" w:eastAsia="Times New Roman" w:hAnsi="Times New Roman" w:cs="Times New Roman"/>
+          <w:i/>
+          <w:sz w:val="18"/>
+          <w:szCs w:val="18"/>
+        </w:rPr>
+        <w:t>1:Standard</w:t>
+      </w:r>
+      <w:proofErr w:type="gramEnd"/>
+      <w:r>
+        <w:rPr>
+          <w:rFonts w:ascii="Times New Roman" w:eastAsia="Times New Roman" w:hAnsi="Times New Roman" w:cs="Times New Roman"/>
+          <w:i/>
+          <w:sz w:val="18"/>
+          <w:szCs w:val="18"/>
+        </w:rPr>
+        <w:t xml:space="preserve"> Self Balancing Robot (Example)</w:t>
       </w:r>
     </w:p>
     <w:p>
@@ -3339,7 +3368,27 @@
           <w:sz w:val="18"/>
           <w:szCs w:val="18"/>
         </w:rPr>
-        <w:t>Figure 2:Arduino Uno Board</w:t>
+        <w:t xml:space="preserve">Figure </w:t>
+      </w:r>
+      <w:proofErr w:type="gramStart"/>
+      <w:r>
+        <w:rPr>
+          <w:rFonts w:ascii="Times New Roman" w:eastAsia="Times New Roman" w:hAnsi="Times New Roman" w:cs="Times New Roman"/>
+          <w:i/>
+          <w:sz w:val="18"/>
+          <w:szCs w:val="18"/>
+        </w:rPr>
+        <w:t>2:Arduino</w:t>
+      </w:r>
+      <w:proofErr w:type="gramEnd"/>
+      <w:r>
+        <w:rPr>
+          <w:rFonts w:ascii="Times New Roman" w:eastAsia="Times New Roman" w:hAnsi="Times New Roman" w:cs="Times New Roman"/>
+          <w:i/>
+          <w:sz w:val="18"/>
+          <w:szCs w:val="18"/>
+        </w:rPr>
+        <w:t xml:space="preserve"> Uno Board</w:t>
       </w:r>
       <w:bookmarkStart w:id="4" w:name="_heading=h.e6q9uh2mq9k0" w:colFirst="0" w:colLast="0"/>
       <w:bookmarkEnd w:id="4"/>
@@ -4122,6 +4171,7 @@
           <w:szCs w:val="24"/>
         </w:rPr>
       </w:pPr>
+      <w:proofErr w:type="spellStart"/>
       <w:r>
         <w:rPr>
           <w:rFonts w:ascii="Times New Roman" w:eastAsia="Times New Roman" w:hAnsi="Times New Roman" w:cs="Times New Roman"/>
@@ -4141,6 +4191,7 @@
         </w:rPr>
         <w:t>desired</w:t>
       </w:r>
+      <w:proofErr w:type="spellEnd"/>
       <w:r>
         <w:rPr>
           <w:rFonts w:ascii="Times New Roman" w:eastAsia="Times New Roman" w:hAnsi="Times New Roman" w:cs="Times New Roman"/>
@@ -4158,6 +4209,7 @@
           <w:szCs w:val="24"/>
         </w:rPr>
       </w:pPr>
+      <w:proofErr w:type="spellStart"/>
       <w:r>
         <w:rPr>
           <w:rFonts w:ascii="Times New Roman" w:eastAsia="Times New Roman" w:hAnsi="Times New Roman" w:cs="Times New Roman"/>
@@ -4177,6 +4229,7 @@
         </w:rPr>
         <w:t>current</w:t>
       </w:r>
+      <w:proofErr w:type="spellEnd"/>
       <w:r>
         <w:rPr>
           <w:rFonts w:ascii="Times New Roman" w:eastAsia="Times New Roman" w:hAnsi="Times New Roman" w:cs="Times New Roman"/>
@@ -4202,6 +4255,7 @@
         </w:rPr>
         <w:t xml:space="preserve">e(t): The error at time t, defined as </w:t>
       </w:r>
+      <w:proofErr w:type="spellStart"/>
       <w:r>
         <w:rPr>
           <w:rFonts w:ascii="Times New Roman" w:eastAsia="Times New Roman" w:hAnsi="Times New Roman" w:cs="Times New Roman"/>
@@ -4219,8 +4273,19 @@
           <w:szCs w:val="24"/>
           <w:highlight w:val="white"/>
         </w:rPr>
-        <w:t xml:space="preserve">desired – </w:t>
-      </w:r>
+        <w:t>desired</w:t>
+      </w:r>
+      <w:proofErr w:type="spellEnd"/>
+      <w:r>
+        <w:rPr>
+          <w:rFonts w:ascii="Times New Roman" w:eastAsia="Times New Roman" w:hAnsi="Times New Roman" w:cs="Times New Roman"/>
+          <w:sz w:val="24"/>
+          <w:szCs w:val="24"/>
+          <w:highlight w:val="white"/>
+        </w:rPr>
+        <w:t xml:space="preserve"> – </w:t>
+      </w:r>
+      <w:proofErr w:type="spellStart"/>
       <w:r>
         <w:rPr>
           <w:rFonts w:ascii="Times New Roman" w:eastAsia="Times New Roman" w:hAnsi="Times New Roman" w:cs="Times New Roman"/>
@@ -4240,6 +4305,7 @@
         </w:rPr>
         <w:t>current</w:t>
       </w:r>
+      <w:proofErr w:type="spellEnd"/>
       <w:r>
         <w:rPr>
           <w:rFonts w:ascii="Times New Roman" w:eastAsia="Times New Roman" w:hAnsi="Times New Roman" w:cs="Times New Roman"/>
@@ -4280,7 +4346,25 @@
           <w:sz w:val="24"/>
           <w:szCs w:val="24"/>
         </w:rPr>
-        <w:t>I(t): The integral term, which takes into account the accumulated past errors.</w:t>
+        <w:t xml:space="preserve">I(t): The integral term, which </w:t>
+      </w:r>
+      <w:proofErr w:type="gramStart"/>
+      <w:r>
+        <w:rPr>
+          <w:rFonts w:ascii="Times New Roman" w:eastAsia="Times New Roman" w:hAnsi="Times New Roman" w:cs="Times New Roman"/>
+          <w:sz w:val="24"/>
+          <w:szCs w:val="24"/>
+        </w:rPr>
+        <w:t>takes into account</w:t>
+      </w:r>
+      <w:proofErr w:type="gramEnd"/>
+      <w:r>
+        <w:rPr>
+          <w:rFonts w:ascii="Times New Roman" w:eastAsia="Times New Roman" w:hAnsi="Times New Roman" w:cs="Times New Roman"/>
+          <w:sz w:val="24"/>
+          <w:szCs w:val="24"/>
+        </w:rPr>
+        <w:t xml:space="preserve"> the accumulated past errors.</w:t>
       </w:r>
     </w:p>
     <w:p>
@@ -4416,6 +4500,7 @@
         </w:rPr>
         <w:t>)=</w:t>
       </w:r>
+      <w:proofErr w:type="spellStart"/>
       <w:r>
         <w:rPr>
           <w:rFonts w:ascii="Times New Roman" w:eastAsia="Times New Roman" w:hAnsi="Times New Roman" w:cs="Times New Roman"/>
@@ -4426,6 +4511,7 @@
         </w:rPr>
         <w:t>Kp</w:t>
       </w:r>
+      <w:proofErr w:type="spellEnd"/>
       <w:sdt>
         <w:sdtPr>
           <w:tag w:val="goog_rdk_0"/>
@@ -4728,6 +4814,7 @@
         </w:rPr>
         <w:t xml:space="preserve">The derivative term estimates the future trend of the error based on its rate of change. It is calculated as the change in error divided by the change in time, multiplied by the derivative gain </w:t>
       </w:r>
+      <w:proofErr w:type="spellStart"/>
       <w:r>
         <w:rPr>
           <w:rFonts w:ascii="Times New Roman" w:eastAsia="Times New Roman" w:hAnsi="Times New Roman" w:cs="Times New Roman"/>
@@ -4738,6 +4825,7 @@
         </w:rPr>
         <w:t>Kd</w:t>
       </w:r>
+      <w:proofErr w:type="spellEnd"/>
       <w:r>
         <w:rPr>
           <w:rFonts w:ascii="Times New Roman" w:eastAsia="Times New Roman" w:hAnsi="Times New Roman" w:cs="Times New Roman"/>
@@ -4798,6 +4886,7 @@
         </w:rPr>
         <w:t>)=</w:t>
       </w:r>
+      <w:proofErr w:type="spellStart"/>
       <w:r>
         <w:rPr>
           <w:rFonts w:ascii="Times New Roman" w:eastAsia="Times New Roman" w:hAnsi="Times New Roman" w:cs="Times New Roman"/>
@@ -4807,6 +4896,7 @@
         </w:rPr>
         <w:t>Kd</w:t>
       </w:r>
+      <w:proofErr w:type="spellEnd"/>
       <w:sdt>
         <w:sdtPr>
           <w:tag w:val="goog_rdk_1"/>
@@ -4949,6 +5039,7 @@
           <w:szCs w:val="24"/>
         </w:rPr>
       </w:pPr>
+      <w:proofErr w:type="spellStart"/>
       <w:r>
         <w:rPr>
           <w:rFonts w:ascii="Times New Roman" w:eastAsia="Times New Roman" w:hAnsi="Times New Roman" w:cs="Times New Roman"/>
@@ -4959,6 +5050,7 @@
         </w:rPr>
         <w:t>Kp</w:t>
       </w:r>
+      <w:proofErr w:type="spellEnd"/>
       <w:r>
         <w:rPr>
           <w:rFonts w:ascii="Times New Roman" w:eastAsia="Times New Roman" w:hAnsi="Times New Roman" w:cs="Times New Roman"/>
@@ -4976,8 +5068,20 @@
           <w:szCs w:val="24"/>
           <w:highlight w:val="white"/>
         </w:rPr>
-        <w:t>Ki and Kd</w:t>
-      </w:r>
+        <w:t xml:space="preserve">Ki and </w:t>
+      </w:r>
+      <w:proofErr w:type="spellStart"/>
+      <w:r>
+        <w:rPr>
+          <w:rFonts w:ascii="Times New Roman" w:eastAsia="Times New Roman" w:hAnsi="Times New Roman" w:cs="Times New Roman"/>
+          <w:i/>
+          <w:sz w:val="24"/>
+          <w:szCs w:val="24"/>
+          <w:highlight w:val="white"/>
+        </w:rPr>
+        <w:t>Kd</w:t>
+      </w:r>
+      <w:proofErr w:type="spellEnd"/>
       <w:r>
         <w:rPr>
           <w:rFonts w:ascii="Times New Roman" w:eastAsia="Times New Roman" w:hAnsi="Times New Roman" w:cs="Times New Roman"/>
@@ -5308,7 +5412,27 @@
           <w:sz w:val="24"/>
           <w:szCs w:val="24"/>
         </w:rPr>
-        <w:t>Choose suitable motors, wheels, chassis, and other mechanical components based on the size and weight requirements of ourrobot.</w:t>
+        <w:t xml:space="preserve">Choose suitable motors, wheels, chassis, and other mechanical components based on the size and weight requirements of </w:t>
+      </w:r>
+      <w:proofErr w:type="spellStart"/>
+      <w:proofErr w:type="gramStart"/>
+      <w:r>
+        <w:rPr>
+          <w:rFonts w:ascii="Times New Roman" w:eastAsia="Times New Roman" w:hAnsi="Times New Roman" w:cs="Times New Roman"/>
+          <w:sz w:val="24"/>
+          <w:szCs w:val="24"/>
+        </w:rPr>
+        <w:t>ourrobot</w:t>
+      </w:r>
+      <w:proofErr w:type="spellEnd"/>
+      <w:proofErr w:type="gramEnd"/>
+      <w:r>
+        <w:rPr>
+          <w:rFonts w:ascii="Times New Roman" w:eastAsia="Times New Roman" w:hAnsi="Times New Roman" w:cs="Times New Roman"/>
+          <w:sz w:val="24"/>
+          <w:szCs w:val="24"/>
+        </w:rPr>
+        <w:t>.</w:t>
       </w:r>
     </w:p>
     <w:p>
@@ -5522,15 +5646,6 @@
         </w:rPr>
         <w:t>Development of the PID controller algorithm to calculate motor commands based on sensor feedback and desired balance setpoint.</w:t>
       </w:r>
-    </w:p>
-    <w:p>
-      <w:pPr>
-        <w:rPr>
-          <w:rFonts w:ascii="Times New Roman" w:eastAsia="Times New Roman" w:hAnsi="Times New Roman" w:cs="Times New Roman"/>
-          <w:sz w:val="24"/>
-          <w:szCs w:val="24"/>
-        </w:rPr>
-      </w:pPr>
     </w:p>
     <w:p>
       <w:pPr>
@@ -5697,141 +5812,6 @@
     </w:p>
     <w:p>
       <w:pPr>
-        <w:rPr>
-          <w:rFonts w:ascii="Times New Roman" w:eastAsia="Times New Roman" w:hAnsi="Times New Roman" w:cs="Times New Roman"/>
-          <w:sz w:val="24"/>
-          <w:szCs w:val="24"/>
-        </w:rPr>
-      </w:pPr>
-    </w:p>
-    <w:p>
-      <w:pPr>
-        <w:rPr>
-          <w:rFonts w:ascii="Times New Roman" w:eastAsia="Times New Roman" w:hAnsi="Times New Roman" w:cs="Times New Roman"/>
-          <w:sz w:val="24"/>
-          <w:szCs w:val="24"/>
-        </w:rPr>
-      </w:pPr>
-    </w:p>
-    <w:p>
-      <w:pPr>
-        <w:rPr>
-          <w:rFonts w:ascii="Times New Roman" w:eastAsia="Times New Roman" w:hAnsi="Times New Roman" w:cs="Times New Roman"/>
-          <w:sz w:val="24"/>
-          <w:szCs w:val="24"/>
-        </w:rPr>
-      </w:pPr>
-    </w:p>
-    <w:p>
-      <w:pPr>
-        <w:rPr>
-          <w:rFonts w:ascii="Times New Roman" w:eastAsia="Times New Roman" w:hAnsi="Times New Roman" w:cs="Times New Roman"/>
-          <w:sz w:val="24"/>
-          <w:szCs w:val="24"/>
-        </w:rPr>
-      </w:pPr>
-    </w:p>
-    <w:p>
-      <w:pPr>
-        <w:rPr>
-          <w:rFonts w:ascii="Times New Roman" w:eastAsia="Times New Roman" w:hAnsi="Times New Roman" w:cs="Times New Roman"/>
-          <w:sz w:val="24"/>
-          <w:szCs w:val="24"/>
-        </w:rPr>
-      </w:pPr>
-    </w:p>
-    <w:p>
-      <w:pPr>
-        <w:rPr>
-          <w:rFonts w:ascii="Times New Roman" w:eastAsia="Times New Roman" w:hAnsi="Times New Roman" w:cs="Times New Roman"/>
-          <w:sz w:val="24"/>
-          <w:szCs w:val="24"/>
-        </w:rPr>
-      </w:pPr>
-    </w:p>
-    <w:p>
-      <w:pPr>
-        <w:rPr>
-          <w:rFonts w:ascii="Times New Roman" w:eastAsia="Times New Roman" w:hAnsi="Times New Roman" w:cs="Times New Roman"/>
-          <w:sz w:val="24"/>
-          <w:szCs w:val="24"/>
-        </w:rPr>
-      </w:pPr>
-    </w:p>
-    <w:p>
-      <w:pPr>
-        <w:rPr>
-          <w:rFonts w:ascii="Times New Roman" w:eastAsia="Times New Roman" w:hAnsi="Times New Roman" w:cs="Times New Roman"/>
-          <w:sz w:val="24"/>
-          <w:szCs w:val="24"/>
-        </w:rPr>
-      </w:pPr>
-    </w:p>
-    <w:p>
-      <w:pPr>
-        <w:rPr>
-          <w:rFonts w:ascii="Times New Roman" w:eastAsia="Times New Roman" w:hAnsi="Times New Roman" w:cs="Times New Roman"/>
-          <w:sz w:val="24"/>
-          <w:szCs w:val="24"/>
-        </w:rPr>
-      </w:pPr>
-    </w:p>
-    <w:p>
-      <w:pPr>
-        <w:rPr>
-          <w:rFonts w:ascii="Times New Roman" w:eastAsia="Times New Roman" w:hAnsi="Times New Roman" w:cs="Times New Roman"/>
-          <w:sz w:val="24"/>
-          <w:szCs w:val="24"/>
-        </w:rPr>
-      </w:pPr>
-    </w:p>
-    <w:p>
-      <w:pPr>
-        <w:rPr>
-          <w:rFonts w:ascii="Times New Roman" w:eastAsia="Times New Roman" w:hAnsi="Times New Roman" w:cs="Times New Roman"/>
-          <w:sz w:val="24"/>
-          <w:szCs w:val="24"/>
-        </w:rPr>
-      </w:pPr>
-    </w:p>
-    <w:p>
-      <w:pPr>
-        <w:rPr>
-          <w:rFonts w:ascii="Times New Roman" w:eastAsia="Times New Roman" w:hAnsi="Times New Roman" w:cs="Times New Roman"/>
-          <w:sz w:val="24"/>
-          <w:szCs w:val="24"/>
-        </w:rPr>
-      </w:pPr>
-    </w:p>
-    <w:p>
-      <w:pPr>
-        <w:rPr>
-          <w:rFonts w:ascii="Times New Roman" w:eastAsia="Times New Roman" w:hAnsi="Times New Roman" w:cs="Times New Roman"/>
-          <w:sz w:val="24"/>
-          <w:szCs w:val="24"/>
-        </w:rPr>
-      </w:pPr>
-    </w:p>
-    <w:p>
-      <w:pPr>
-        <w:rPr>
-          <w:rFonts w:ascii="Times New Roman" w:eastAsia="Times New Roman" w:hAnsi="Times New Roman" w:cs="Times New Roman"/>
-          <w:sz w:val="24"/>
-          <w:szCs w:val="24"/>
-        </w:rPr>
-      </w:pPr>
-    </w:p>
-    <w:p>
-      <w:pPr>
-        <w:rPr>
-          <w:rFonts w:ascii="Times New Roman" w:eastAsia="Times New Roman" w:hAnsi="Times New Roman" w:cs="Times New Roman"/>
-          <w:sz w:val="24"/>
-          <w:szCs w:val="24"/>
-        </w:rPr>
-      </w:pPr>
-    </w:p>
-    <w:p>
-      <w:pPr>
         <w:pStyle w:val="Heading1"/>
         <w:rPr>
           <w:rFonts w:ascii="Times New Roman" w:eastAsia="Times New Roman" w:hAnsi="Times New Roman" w:cs="Times New Roman"/>
@@ -5848,6 +5828,7 @@
           <w:sz w:val="28"/>
           <w:szCs w:val="28"/>
         </w:rPr>
+        <w:lastRenderedPageBreak/>
         <w:t>Potential Benefits: -</w:t>
       </w:r>
       <w:bookmarkEnd w:id="29"/>
@@ -5880,10 +5861,20 @@
       <w:r>
         <w:rPr>
           <w:rFonts w:ascii="Times New Roman" w:eastAsia="Times New Roman" w:hAnsi="Times New Roman" w:cs="Times New Roman"/>
-          <w:sz w:val="24"/>
-          <w:szCs w:val="24"/>
-        </w:rPr>
-        <w:t>Education and Learning: Engaging in this project provides an excellent opportunity for individuals to learn about various aspects of robotics, including hardware integration, sensor fusion, control theory, and programming with Arduino.</w:t>
+          <w:b/>
+          <w:bCs/>
+          <w:sz w:val="24"/>
+          <w:szCs w:val="24"/>
+        </w:rPr>
+        <w:t>Education and Learning</w:t>
+      </w:r>
+      <w:r>
+        <w:rPr>
+          <w:rFonts w:ascii="Times New Roman" w:eastAsia="Times New Roman" w:hAnsi="Times New Roman" w:cs="Times New Roman"/>
+          <w:sz w:val="24"/>
+          <w:szCs w:val="24"/>
+        </w:rPr>
+        <w:t>: Engaging in this project provides an excellent opportunity for individuals to learn about various aspects of robotics, including hardware integration, sensor fusion, control theory, and programming with Arduino.</w:t>
       </w:r>
     </w:p>
     <w:p>
@@ -5960,7 +5951,6 @@
           <w:sz w:val="24"/>
           <w:szCs w:val="24"/>
         </w:rPr>
-        <w:lastRenderedPageBreak/>
         <w:t>Innovation and Creativity: Participants are encouraged to explore innovative solutions and apply creative thinking to improve the design, functionality, and performance of the self-balancing robot.</w:t>
       </w:r>
     </w:p>
@@ -5995,9 +5985,19 @@
           <w:sz w:val="24"/>
           <w:szCs w:val="24"/>
         </w:rPr>
-        <w:t>Practical Applications: Balancing robots with trays or compartments could navigate uneven terrain and deliver packages, especially in areas with limited infrastructure. Small, agile balancing robots could navigate disaster zones to locate survivors and assess damage. [The skills and knowledge gained from this project can be applied to develop other robotics projects and potentially contribute to real-world applications such as assistive technology, automation, and industrial robotics.]</w:t>
-      </w:r>
-    </w:p>
+        <w:t xml:space="preserve">Practical Applications: </w:t>
+      </w:r>
+      <w:bookmarkStart w:id="30" w:name="_Hlk158491594"/>
+      <w:r>
+        <w:rPr>
+          <w:rFonts w:ascii="Times New Roman" w:eastAsia="Times New Roman" w:hAnsi="Times New Roman" w:cs="Times New Roman"/>
+          <w:sz w:val="24"/>
+          <w:szCs w:val="24"/>
+        </w:rPr>
+        <w:t xml:space="preserve">Balancing robots with trays or compartments could navigate uneven terrain and deliver packages, especially in areas with limited infrastructure. Small, agile balancing robots could navigate disaster zones to locate survivors and assess damage. </w:t>
+      </w:r>
+    </w:p>
+    <w:bookmarkEnd w:id="30"/>
     <w:p>
       <w:pPr>
         <w:rPr>
@@ -6017,14 +6017,23 @@
     </w:p>
     <w:p>
       <w:pPr>
+        <w:rPr>
+          <w:rFonts w:ascii="Times New Roman" w:eastAsia="Times New Roman" w:hAnsi="Times New Roman" w:cs="Times New Roman"/>
+          <w:sz w:val="24"/>
+          <w:szCs w:val="24"/>
+        </w:rPr>
+      </w:pPr>
+    </w:p>
+    <w:p>
+      <w:pPr>
         <w:pStyle w:val="Heading1"/>
         <w:rPr>
           <w:rFonts w:ascii="Times New Roman" w:eastAsia="Times New Roman" w:hAnsi="Times New Roman" w:cs="Times New Roman"/>
           <w:color w:val="000000"/>
         </w:rPr>
       </w:pPr>
-      <w:bookmarkStart w:id="30" w:name="_heading=h.rjiqe0qf9qoo" w:colFirst="0" w:colLast="0"/>
-      <w:bookmarkEnd w:id="30"/>
+      <w:bookmarkStart w:id="31" w:name="_heading=h.rjiqe0qf9qoo" w:colFirst="0" w:colLast="0"/>
+      <w:bookmarkEnd w:id="31"/>
     </w:p>
     <w:p/>
     <w:p/>
@@ -6036,12 +6045,11 @@
           <w:color w:val="000000"/>
         </w:rPr>
       </w:pPr>
-      <w:bookmarkStart w:id="31" w:name="_heading=h.6ps0nzv4ei29" w:colFirst="0" w:colLast="0"/>
-      <w:bookmarkEnd w:id="31"/>
+      <w:bookmarkStart w:id="32" w:name="_heading=h.6ps0nzv4ei29" w:colFirst="0" w:colLast="0"/>
+      <w:bookmarkEnd w:id="32"/>
     </w:p>
     <w:p/>
     <w:p/>
-    <w:p/>
     <w:p>
       <w:pPr>
         <w:pStyle w:val="Heading1"/>
@@ -6053,10 +6061,8 @@
           <w:szCs w:val="28"/>
         </w:rPr>
       </w:pPr>
-    </w:p>
-    <w:p>
-      <w:pPr>
-        <w:pStyle w:val="Heading1"/>
+      <w:bookmarkStart w:id="33" w:name="_Toc158479483"/>
+      <w:r>
         <w:rPr>
           <w:rFonts w:ascii="Times New Roman" w:eastAsia="Times New Roman" w:hAnsi="Times New Roman" w:cs="Times New Roman"/>
           <w:b/>
@@ -6064,11 +6070,11 @@
           <w:sz w:val="28"/>
           <w:szCs w:val="28"/>
         </w:rPr>
-      </w:pPr>
-    </w:p>
-    <w:p>
-      <w:pPr>
-        <w:pStyle w:val="Heading1"/>
+        <w:lastRenderedPageBreak/>
+        <w:t xml:space="preserve">Milestone and </w:t>
+      </w:r>
+      <w:proofErr w:type="gramStart"/>
+      <w:r>
         <w:rPr>
           <w:rFonts w:ascii="Times New Roman" w:eastAsia="Times New Roman" w:hAnsi="Times New Roman" w:cs="Times New Roman"/>
           <w:b/>
@@ -6076,76 +6082,364 @@
           <w:sz w:val="28"/>
           <w:szCs w:val="28"/>
         </w:rPr>
-      </w:pPr>
-    </w:p>
-    <w:p>
-      <w:pPr>
-        <w:pStyle w:val="Heading1"/>
-        <w:rPr>
-          <w:rFonts w:ascii="Times New Roman" w:eastAsia="Times New Roman" w:hAnsi="Times New Roman" w:cs="Times New Roman"/>
-          <w:b/>
+        <w:t>Schedule:-</w:t>
+      </w:r>
+      <w:bookmarkEnd w:id="33"/>
+      <w:proofErr w:type="gramEnd"/>
+    </w:p>
+    <w:p>
+      <w:pPr>
+        <w:rPr>
+          <w:rFonts w:ascii="Times New Roman" w:eastAsia="Times New Roman" w:hAnsi="Times New Roman" w:cs="Times New Roman"/>
+          <w:b/>
+          <w:sz w:val="28"/>
+          <w:szCs w:val="28"/>
+        </w:rPr>
+      </w:pPr>
+    </w:p>
+    <w:p>
+      <w:pPr>
+        <w:pStyle w:val="Heading2"/>
+        <w:rPr>
+          <w:rFonts w:ascii="Times New Roman" w:eastAsia="Times New Roman" w:hAnsi="Times New Roman" w:cs="Times New Roman"/>
           <w:color w:val="000000"/>
-          <w:sz w:val="28"/>
-          <w:szCs w:val="28"/>
-        </w:rPr>
-      </w:pPr>
-    </w:p>
-    <w:p>
-      <w:pPr>
-        <w:pStyle w:val="Heading1"/>
-        <w:rPr>
-          <w:rFonts w:ascii="Times New Roman" w:eastAsia="Times New Roman" w:hAnsi="Times New Roman" w:cs="Times New Roman"/>
-          <w:b/>
+        </w:rPr>
+      </w:pPr>
+      <w:bookmarkStart w:id="34" w:name="_Toc158479484"/>
+      <w:r>
+        <w:rPr>
+          <w:rFonts w:ascii="Times New Roman" w:eastAsia="Times New Roman" w:hAnsi="Times New Roman" w:cs="Times New Roman"/>
           <w:color w:val="000000"/>
-          <w:sz w:val="28"/>
-          <w:szCs w:val="28"/>
-        </w:rPr>
-      </w:pPr>
-    </w:p>
-    <w:p>
-      <w:pPr>
-        <w:pStyle w:val="Heading1"/>
-        <w:rPr>
-          <w:rFonts w:ascii="Times New Roman" w:eastAsia="Times New Roman" w:hAnsi="Times New Roman" w:cs="Times New Roman"/>
-          <w:b/>
+        </w:rPr>
+        <w:t>Milestone:</w:t>
+      </w:r>
+      <w:bookmarkEnd w:id="34"/>
+    </w:p>
+    <w:p>
+      <w:pPr>
+        <w:rPr>
+          <w:rFonts w:ascii="Times New Roman" w:eastAsia="Times New Roman" w:hAnsi="Times New Roman" w:cs="Times New Roman"/>
+          <w:sz w:val="28"/>
+          <w:szCs w:val="28"/>
+        </w:rPr>
+      </w:pPr>
+      <w:r>
+        <w:rPr>
+          <w:rFonts w:ascii="Times New Roman" w:eastAsia="Times New Roman" w:hAnsi="Times New Roman" w:cs="Times New Roman"/>
+          <w:sz w:val="28"/>
+          <w:szCs w:val="28"/>
+        </w:rPr>
+        <w:t>Here's a proposed milestone breakdown for the self-balancing robot project:</w:t>
+      </w:r>
+    </w:p>
+    <w:p>
+      <w:pPr>
+        <w:rPr>
+          <w:rFonts w:ascii="Times New Roman" w:eastAsia="Times New Roman" w:hAnsi="Times New Roman" w:cs="Times New Roman"/>
+          <w:sz w:val="28"/>
+          <w:szCs w:val="28"/>
+        </w:rPr>
+      </w:pPr>
+    </w:p>
+    <w:p>
+      <w:pPr>
+        <w:pStyle w:val="Heading3"/>
+        <w:rPr>
+          <w:rFonts w:ascii="Times New Roman" w:eastAsia="Times New Roman" w:hAnsi="Times New Roman" w:cs="Times New Roman"/>
           <w:color w:val="000000"/>
-          <w:sz w:val="28"/>
-          <w:szCs w:val="28"/>
-        </w:rPr>
-      </w:pPr>
-    </w:p>
-    <w:p/>
-    <w:p/>
-    <w:p>
-      <w:pPr>
-        <w:pStyle w:val="Heading1"/>
-        <w:rPr>
-          <w:rFonts w:ascii="Times New Roman" w:eastAsia="Times New Roman" w:hAnsi="Times New Roman" w:cs="Times New Roman"/>
-          <w:b/>
+        </w:rPr>
+      </w:pPr>
+      <w:bookmarkStart w:id="35" w:name="_Toc158479485"/>
+      <w:r>
+        <w:rPr>
+          <w:rFonts w:ascii="Times New Roman" w:eastAsia="Times New Roman" w:hAnsi="Times New Roman" w:cs="Times New Roman"/>
           <w:color w:val="000000"/>
-          <w:sz w:val="28"/>
-          <w:szCs w:val="28"/>
-        </w:rPr>
-      </w:pPr>
-      <w:bookmarkStart w:id="32" w:name="_Toc158479483"/>
-      <w:r>
-        <w:rPr>
-          <w:rFonts w:ascii="Times New Roman" w:eastAsia="Times New Roman" w:hAnsi="Times New Roman" w:cs="Times New Roman"/>
-          <w:b/>
+        </w:rPr>
+        <w:t>Project Initiation and Planning (Week 1-2):</w:t>
+      </w:r>
+      <w:bookmarkEnd w:id="35"/>
+    </w:p>
+    <w:p>
+      <w:pPr>
+        <w:rPr>
+          <w:rFonts w:ascii="Times New Roman" w:eastAsia="Times New Roman" w:hAnsi="Times New Roman" w:cs="Times New Roman"/>
+          <w:sz w:val="28"/>
+          <w:szCs w:val="28"/>
+        </w:rPr>
+      </w:pPr>
+      <w:r>
+        <w:rPr>
+          <w:rFonts w:ascii="Times New Roman" w:eastAsia="Times New Roman" w:hAnsi="Times New Roman" w:cs="Times New Roman"/>
+          <w:sz w:val="28"/>
+          <w:szCs w:val="28"/>
+        </w:rPr>
+        <w:t>Research existing self-balancing robot designs, control algorithms, and hardware components. Create a detailed project plan outlining tasks, timeline, and resource requirements. Procure necessary materials and components.</w:t>
+      </w:r>
+    </w:p>
+    <w:p>
+      <w:pPr>
+        <w:pStyle w:val="Heading3"/>
+        <w:rPr>
+          <w:rFonts w:ascii="Times New Roman" w:eastAsia="Times New Roman" w:hAnsi="Times New Roman" w:cs="Times New Roman"/>
           <w:color w:val="000000"/>
-          <w:sz w:val="28"/>
-          <w:szCs w:val="28"/>
-        </w:rPr>
-        <w:lastRenderedPageBreak/>
-        <w:t>Milestone and Schedule:-</w:t>
-      </w:r>
-      <w:bookmarkEnd w:id="32"/>
-    </w:p>
-    <w:p>
-      <w:pPr>
-        <w:rPr>
-          <w:rFonts w:ascii="Times New Roman" w:eastAsia="Times New Roman" w:hAnsi="Times New Roman" w:cs="Times New Roman"/>
-          <w:b/>
+        </w:rPr>
+      </w:pPr>
+    </w:p>
+    <w:p>
+      <w:pPr>
+        <w:pStyle w:val="Heading3"/>
+        <w:rPr>
+          <w:rFonts w:ascii="Times New Roman" w:eastAsia="Times New Roman" w:hAnsi="Times New Roman" w:cs="Times New Roman"/>
+          <w:color w:val="000000"/>
+        </w:rPr>
+      </w:pPr>
+      <w:bookmarkStart w:id="36" w:name="_Toc158479486"/>
+      <w:r>
+        <w:rPr>
+          <w:rFonts w:ascii="Times New Roman" w:eastAsia="Times New Roman" w:hAnsi="Times New Roman" w:cs="Times New Roman"/>
+          <w:color w:val="000000"/>
+        </w:rPr>
+        <w:t>Mechanical Assembly and Hardware Integration (Week 3-4):</w:t>
+      </w:r>
+      <w:bookmarkEnd w:id="36"/>
+    </w:p>
+    <w:p>
+      <w:pPr>
+        <w:rPr>
+          <w:rFonts w:ascii="Times New Roman" w:eastAsia="Times New Roman" w:hAnsi="Times New Roman" w:cs="Times New Roman"/>
+          <w:sz w:val="28"/>
+          <w:szCs w:val="28"/>
+        </w:rPr>
+      </w:pPr>
+      <w:r>
+        <w:rPr>
+          <w:rFonts w:ascii="Times New Roman" w:eastAsia="Times New Roman" w:hAnsi="Times New Roman" w:cs="Times New Roman"/>
+          <w:sz w:val="28"/>
+          <w:szCs w:val="28"/>
+        </w:rPr>
+        <w:t>Assemble the robot chassis, attach motors, wheels, and other mechanical components. Mount sensors, including the MPU-6050 gyroscope and accelerometer, and connect them to the Arduino. Test mechanical components for proper fit and functionality.</w:t>
+      </w:r>
+    </w:p>
+    <w:p>
+      <w:pPr>
+        <w:pStyle w:val="Heading3"/>
+        <w:rPr>
+          <w:rFonts w:ascii="Times New Roman" w:eastAsia="Times New Roman" w:hAnsi="Times New Roman" w:cs="Times New Roman"/>
+          <w:color w:val="000000"/>
+        </w:rPr>
+      </w:pPr>
+    </w:p>
+    <w:p>
+      <w:pPr>
+        <w:pStyle w:val="Heading3"/>
+        <w:rPr>
+          <w:rFonts w:ascii="Times New Roman" w:eastAsia="Times New Roman" w:hAnsi="Times New Roman" w:cs="Times New Roman"/>
+          <w:color w:val="000000"/>
+        </w:rPr>
+      </w:pPr>
+      <w:bookmarkStart w:id="37" w:name="_Toc158479487"/>
+      <w:r>
+        <w:rPr>
+          <w:rFonts w:ascii="Times New Roman" w:eastAsia="Times New Roman" w:hAnsi="Times New Roman" w:cs="Times New Roman"/>
+          <w:color w:val="000000"/>
+        </w:rPr>
+        <w:t>Software Development (Week 5-8):</w:t>
+      </w:r>
+      <w:bookmarkEnd w:id="37"/>
+    </w:p>
+    <w:p>
+      <w:pPr>
+        <w:rPr>
+          <w:rFonts w:ascii="Times New Roman" w:eastAsia="Times New Roman" w:hAnsi="Times New Roman" w:cs="Times New Roman"/>
+          <w:sz w:val="28"/>
+          <w:szCs w:val="28"/>
+        </w:rPr>
+      </w:pPr>
+      <w:r>
+        <w:rPr>
+          <w:rFonts w:ascii="Times New Roman" w:eastAsia="Times New Roman" w:hAnsi="Times New Roman" w:cs="Times New Roman"/>
+          <w:sz w:val="28"/>
+          <w:szCs w:val="28"/>
+        </w:rPr>
+        <w:t>Develop Arduino sketches to interface with sensors and read data from the MPU-6050 module and ultrasonic sensor. Implement sensor fusion algorithms to combine data from the gyroscope and accelerometer. Design and implement the PID controller algorithm for balance control. Test software components individually and integrate them into a cohesive codebase.</w:t>
+      </w:r>
+    </w:p>
+    <w:p>
+      <w:pPr>
+        <w:rPr>
+          <w:rFonts w:ascii="Times New Roman" w:eastAsia="Times New Roman" w:hAnsi="Times New Roman" w:cs="Times New Roman"/>
+          <w:sz w:val="28"/>
+          <w:szCs w:val="28"/>
+        </w:rPr>
+      </w:pPr>
+    </w:p>
+    <w:p>
+      <w:pPr>
+        <w:pStyle w:val="Heading3"/>
+        <w:rPr>
+          <w:rFonts w:ascii="Times New Roman" w:eastAsia="Times New Roman" w:hAnsi="Times New Roman" w:cs="Times New Roman"/>
+          <w:color w:val="000000"/>
+          <w:sz w:val="28"/>
+          <w:szCs w:val="28"/>
+        </w:rPr>
+      </w:pPr>
+      <w:bookmarkStart w:id="38" w:name="_Toc158479488"/>
+      <w:r>
+        <w:rPr>
+          <w:rFonts w:ascii="Times New Roman" w:eastAsia="Times New Roman" w:hAnsi="Times New Roman" w:cs="Times New Roman"/>
+          <w:color w:val="000000"/>
+        </w:rPr>
+        <w:t>Testing and Calibration (Week 9-10):</w:t>
+      </w:r>
+      <w:bookmarkEnd w:id="38"/>
+    </w:p>
+    <w:p>
+      <w:pPr>
+        <w:rPr>
+          <w:rFonts w:ascii="Times New Roman" w:eastAsia="Times New Roman" w:hAnsi="Times New Roman" w:cs="Times New Roman"/>
+          <w:sz w:val="28"/>
+          <w:szCs w:val="28"/>
+        </w:rPr>
+      </w:pPr>
+      <w:r>
+        <w:rPr>
+          <w:rFonts w:ascii="Times New Roman" w:eastAsia="Times New Roman" w:hAnsi="Times New Roman" w:cs="Times New Roman"/>
+          <w:sz w:val="28"/>
+          <w:szCs w:val="28"/>
+        </w:rPr>
+        <w:t>Conduct initial tests to verify sensor readings, motor control, and balance performance. Fine-tune PID controller parameters through iterative testing and calibration. Evaluate the robot's ability to maintain balance under various conditions and external disturbances.</w:t>
+      </w:r>
+    </w:p>
+    <w:p>
+      <w:pPr>
+        <w:rPr>
+          <w:rFonts w:ascii="Times New Roman" w:eastAsia="Times New Roman" w:hAnsi="Times New Roman" w:cs="Times New Roman"/>
+          <w:sz w:val="28"/>
+          <w:szCs w:val="28"/>
+        </w:rPr>
+      </w:pPr>
+    </w:p>
+    <w:p>
+      <w:pPr>
+        <w:pStyle w:val="Heading3"/>
+        <w:rPr>
+          <w:rFonts w:ascii="Times New Roman" w:eastAsia="Times New Roman" w:hAnsi="Times New Roman" w:cs="Times New Roman"/>
+          <w:color w:val="000000"/>
+          <w:sz w:val="28"/>
+          <w:szCs w:val="28"/>
+        </w:rPr>
+      </w:pPr>
+      <w:bookmarkStart w:id="39" w:name="_Toc158479489"/>
+      <w:r>
+        <w:rPr>
+          <w:rFonts w:ascii="Times New Roman" w:eastAsia="Times New Roman" w:hAnsi="Times New Roman" w:cs="Times New Roman"/>
+          <w:color w:val="000000"/>
+        </w:rPr>
+        <w:t>Optimization and Refinement (Week 11-12):</w:t>
+      </w:r>
+      <w:bookmarkEnd w:id="39"/>
+    </w:p>
+    <w:p>
+      <w:pPr>
+        <w:rPr>
+          <w:rFonts w:ascii="Times New Roman" w:eastAsia="Times New Roman" w:hAnsi="Times New Roman" w:cs="Times New Roman"/>
+          <w:sz w:val="28"/>
+          <w:szCs w:val="28"/>
+        </w:rPr>
+      </w:pPr>
+      <w:r>
+        <w:rPr>
+          <w:rFonts w:ascii="Times New Roman" w:eastAsia="Times New Roman" w:hAnsi="Times New Roman" w:cs="Times New Roman"/>
+          <w:sz w:val="28"/>
+          <w:szCs w:val="28"/>
+        </w:rPr>
+        <w:t>Address any mechanical issues, hardware limitations, or software bugs identified during testing. Optimize code efficiency and performance to enhance real-time responsiveness. Document observations and modifications made during the optimization process.</w:t>
+      </w:r>
+    </w:p>
+    <w:p>
+      <w:pPr>
+        <w:rPr>
+          <w:rFonts w:ascii="Times New Roman" w:eastAsia="Times New Roman" w:hAnsi="Times New Roman" w:cs="Times New Roman"/>
+          <w:sz w:val="28"/>
+          <w:szCs w:val="28"/>
+        </w:rPr>
+      </w:pPr>
+    </w:p>
+    <w:p>
+      <w:pPr>
+        <w:pStyle w:val="Heading3"/>
+        <w:rPr>
+          <w:rFonts w:ascii="Times New Roman" w:eastAsia="Times New Roman" w:hAnsi="Times New Roman" w:cs="Times New Roman"/>
+          <w:color w:val="000000"/>
+          <w:sz w:val="28"/>
+          <w:szCs w:val="28"/>
+        </w:rPr>
+      </w:pPr>
+      <w:bookmarkStart w:id="40" w:name="_Toc158479490"/>
+      <w:r>
+        <w:rPr>
+          <w:rFonts w:ascii="Times New Roman" w:eastAsia="Times New Roman" w:hAnsi="Times New Roman" w:cs="Times New Roman"/>
+          <w:color w:val="000000"/>
+        </w:rPr>
+        <w:t>Documentation and Presentation (Week 13):</w:t>
+      </w:r>
+      <w:bookmarkEnd w:id="40"/>
+    </w:p>
+    <w:p>
+      <w:pPr>
+        <w:rPr>
+          <w:rFonts w:ascii="Times New Roman" w:eastAsia="Times New Roman" w:hAnsi="Times New Roman" w:cs="Times New Roman"/>
+          <w:sz w:val="28"/>
+          <w:szCs w:val="28"/>
+        </w:rPr>
+      </w:pPr>
+      <w:r>
+        <w:rPr>
+          <w:rFonts w:ascii="Times New Roman" w:eastAsia="Times New Roman" w:hAnsi="Times New Roman" w:cs="Times New Roman"/>
+          <w:sz w:val="28"/>
+          <w:szCs w:val="28"/>
+        </w:rPr>
+        <w:t>Document the project progress, including design choices, implementation details, and testing outcomes. Prepare written reports, presentations, or video demonstrations showcasing the self-balancing robot and its capabilities.</w:t>
+      </w:r>
+    </w:p>
+    <w:p>
+      <w:pPr>
+        <w:rPr>
+          <w:rFonts w:ascii="Times New Roman" w:eastAsia="Times New Roman" w:hAnsi="Times New Roman" w:cs="Times New Roman"/>
+          <w:sz w:val="28"/>
+          <w:szCs w:val="28"/>
+        </w:rPr>
+      </w:pPr>
+      <w:r>
+        <w:rPr>
+          <w:rFonts w:ascii="Times New Roman" w:eastAsia="Times New Roman" w:hAnsi="Times New Roman" w:cs="Times New Roman"/>
+          <w:sz w:val="28"/>
+          <w:szCs w:val="28"/>
+        </w:rPr>
+        <w:t>Share project findings and experiences with the robotics community through online forums, blogs, or social media platforms.</w:t>
+      </w:r>
+    </w:p>
+    <w:p>
+      <w:pPr>
+        <w:rPr>
+          <w:rFonts w:ascii="Times New Roman" w:eastAsia="Times New Roman" w:hAnsi="Times New Roman" w:cs="Times New Roman"/>
+          <w:sz w:val="28"/>
+          <w:szCs w:val="28"/>
+        </w:rPr>
+      </w:pPr>
+      <w:r>
+        <w:rPr>
+          <w:rFonts w:ascii="Times New Roman" w:eastAsia="Times New Roman" w:hAnsi="Times New Roman" w:cs="Times New Roman"/>
+          <w:sz w:val="28"/>
+          <w:szCs w:val="28"/>
+        </w:rPr>
+        <w:t>By breaking down the project into these milestones, we can track progress, manage tasks effectively, and ensure timely completion of the self-balancing robot project. Adjustments to the timeline may be necessary based on project complexity, resource availability, and unforeseen challenges encountered during implementation. We will make sure that any diversion in this plan is well informed and shared with the professor.</w:t>
+      </w:r>
+    </w:p>
+    <w:p>
+      <w:pPr>
+        <w:rPr>
+          <w:rFonts w:ascii="Times New Roman" w:eastAsia="Times New Roman" w:hAnsi="Times New Roman" w:cs="Times New Roman"/>
           <w:sz w:val="28"/>
           <w:szCs w:val="28"/>
         </w:rPr>
@@ -6157,360 +6451,12 @@
         <w:rPr>
           <w:rFonts w:ascii="Times New Roman" w:eastAsia="Times New Roman" w:hAnsi="Times New Roman" w:cs="Times New Roman"/>
           <w:color w:val="000000"/>
-        </w:rPr>
-      </w:pPr>
-      <w:bookmarkStart w:id="33" w:name="_Toc158479484"/>
-      <w:r>
-        <w:rPr>
-          <w:rFonts w:ascii="Times New Roman" w:eastAsia="Times New Roman" w:hAnsi="Times New Roman" w:cs="Times New Roman"/>
-          <w:color w:val="000000"/>
-        </w:rPr>
-        <w:t>Milestone:</w:t>
-      </w:r>
-      <w:bookmarkEnd w:id="33"/>
-    </w:p>
-    <w:p>
-      <w:pPr>
-        <w:rPr>
-          <w:rFonts w:ascii="Times New Roman" w:eastAsia="Times New Roman" w:hAnsi="Times New Roman" w:cs="Times New Roman"/>
-          <w:sz w:val="28"/>
-          <w:szCs w:val="28"/>
-        </w:rPr>
-      </w:pPr>
-      <w:r>
-        <w:rPr>
-          <w:rFonts w:ascii="Times New Roman" w:eastAsia="Times New Roman" w:hAnsi="Times New Roman" w:cs="Times New Roman"/>
-          <w:sz w:val="28"/>
-          <w:szCs w:val="28"/>
-        </w:rPr>
-        <w:t>Here's a proposed milestone breakdown for the self-balancing robot project:</w:t>
-      </w:r>
-    </w:p>
-    <w:p>
-      <w:pPr>
-        <w:rPr>
-          <w:rFonts w:ascii="Times New Roman" w:eastAsia="Times New Roman" w:hAnsi="Times New Roman" w:cs="Times New Roman"/>
-          <w:sz w:val="28"/>
-          <w:szCs w:val="28"/>
-        </w:rPr>
-      </w:pPr>
-    </w:p>
-    <w:p>
-      <w:pPr>
-        <w:pStyle w:val="Heading3"/>
-        <w:rPr>
-          <w:rFonts w:ascii="Times New Roman" w:eastAsia="Times New Roman" w:hAnsi="Times New Roman" w:cs="Times New Roman"/>
-          <w:color w:val="000000"/>
-        </w:rPr>
-      </w:pPr>
-      <w:bookmarkStart w:id="34" w:name="_Toc158479485"/>
-      <w:r>
-        <w:rPr>
-          <w:rFonts w:ascii="Times New Roman" w:eastAsia="Times New Roman" w:hAnsi="Times New Roman" w:cs="Times New Roman"/>
-          <w:color w:val="000000"/>
-        </w:rPr>
-        <w:t>Project Initiation and Planning (Week 1-2):</w:t>
-      </w:r>
-      <w:bookmarkEnd w:id="34"/>
-    </w:p>
-    <w:p>
-      <w:pPr>
-        <w:rPr>
-          <w:rFonts w:ascii="Times New Roman" w:eastAsia="Times New Roman" w:hAnsi="Times New Roman" w:cs="Times New Roman"/>
-          <w:sz w:val="28"/>
-          <w:szCs w:val="28"/>
-        </w:rPr>
-      </w:pPr>
-      <w:r>
-        <w:rPr>
-          <w:rFonts w:ascii="Times New Roman" w:eastAsia="Times New Roman" w:hAnsi="Times New Roman" w:cs="Times New Roman"/>
-          <w:sz w:val="28"/>
-          <w:szCs w:val="28"/>
-        </w:rPr>
-        <w:t>Research existing self-balancing robot designs, control algorithms, and hardware components. Create a detailed project plan outlining tasks, timeline, and resource requirements. Procure necessary materials and components.</w:t>
-      </w:r>
-    </w:p>
-    <w:p>
-      <w:pPr>
-        <w:pStyle w:val="Heading3"/>
-        <w:rPr>
-          <w:rFonts w:ascii="Times New Roman" w:eastAsia="Times New Roman" w:hAnsi="Times New Roman" w:cs="Times New Roman"/>
-          <w:color w:val="000000"/>
-        </w:rPr>
-      </w:pPr>
-    </w:p>
-    <w:p>
-      <w:pPr>
-        <w:pStyle w:val="Heading3"/>
-        <w:rPr>
-          <w:rFonts w:ascii="Times New Roman" w:eastAsia="Times New Roman" w:hAnsi="Times New Roman" w:cs="Times New Roman"/>
-          <w:color w:val="000000"/>
-        </w:rPr>
-      </w:pPr>
-      <w:bookmarkStart w:id="35" w:name="_Toc158479486"/>
-      <w:r>
-        <w:rPr>
-          <w:rFonts w:ascii="Times New Roman" w:eastAsia="Times New Roman" w:hAnsi="Times New Roman" w:cs="Times New Roman"/>
-          <w:color w:val="000000"/>
-        </w:rPr>
-        <w:t>Mechanical Assembly and Hardware Integration (Week 3-4):</w:t>
-      </w:r>
-      <w:bookmarkEnd w:id="35"/>
-    </w:p>
-    <w:p>
-      <w:pPr>
-        <w:rPr>
-          <w:rFonts w:ascii="Times New Roman" w:eastAsia="Times New Roman" w:hAnsi="Times New Roman" w:cs="Times New Roman"/>
-          <w:sz w:val="28"/>
-          <w:szCs w:val="28"/>
-        </w:rPr>
-      </w:pPr>
-      <w:r>
-        <w:rPr>
-          <w:rFonts w:ascii="Times New Roman" w:eastAsia="Times New Roman" w:hAnsi="Times New Roman" w:cs="Times New Roman"/>
-          <w:sz w:val="28"/>
-          <w:szCs w:val="28"/>
-        </w:rPr>
-        <w:t>Assemble the robot chassis, attach motors, wheels, and other mechanical components. Mount sensors, including the MPU-6050 gyroscope and accelerometer, and connect them to the Arduino. Test mechanical components for proper fit and functionality.</w:t>
-      </w:r>
-    </w:p>
-    <w:p>
-      <w:pPr>
-        <w:pStyle w:val="Heading3"/>
-        <w:rPr>
-          <w:rFonts w:ascii="Times New Roman" w:eastAsia="Times New Roman" w:hAnsi="Times New Roman" w:cs="Times New Roman"/>
-          <w:color w:val="000000"/>
-        </w:rPr>
-      </w:pPr>
-    </w:p>
-    <w:p>
-      <w:pPr>
-        <w:pStyle w:val="Heading3"/>
-        <w:rPr>
-          <w:rFonts w:ascii="Times New Roman" w:eastAsia="Times New Roman" w:hAnsi="Times New Roman" w:cs="Times New Roman"/>
-          <w:color w:val="000000"/>
-        </w:rPr>
-      </w:pPr>
-      <w:bookmarkStart w:id="36" w:name="_Toc158479487"/>
-      <w:r>
-        <w:rPr>
-          <w:rFonts w:ascii="Times New Roman" w:eastAsia="Times New Roman" w:hAnsi="Times New Roman" w:cs="Times New Roman"/>
-          <w:color w:val="000000"/>
-        </w:rPr>
-        <w:t>Software Development (Week 5-8):</w:t>
-      </w:r>
-      <w:bookmarkEnd w:id="36"/>
-    </w:p>
-    <w:p>
-      <w:pPr>
-        <w:rPr>
-          <w:rFonts w:ascii="Times New Roman" w:eastAsia="Times New Roman" w:hAnsi="Times New Roman" w:cs="Times New Roman"/>
-          <w:sz w:val="28"/>
-          <w:szCs w:val="28"/>
-        </w:rPr>
-      </w:pPr>
-      <w:r>
-        <w:rPr>
-          <w:rFonts w:ascii="Times New Roman" w:eastAsia="Times New Roman" w:hAnsi="Times New Roman" w:cs="Times New Roman"/>
-          <w:sz w:val="28"/>
-          <w:szCs w:val="28"/>
-        </w:rPr>
-        <w:t>Develop Arduino sketches to interface with sensors and read data from the MPU-6050 module and ultrasonic sensor. Implement sensor fusion algorithms to combine data from the gyroscope and accelerometer. Design and implement the PID controller algorithm for balance control. Test software components individually and integrate them into a cohesive codebase.</w:t>
-      </w:r>
-    </w:p>
-    <w:p>
-      <w:pPr>
-        <w:rPr>
-          <w:rFonts w:ascii="Times New Roman" w:eastAsia="Times New Roman" w:hAnsi="Times New Roman" w:cs="Times New Roman"/>
-          <w:sz w:val="28"/>
-          <w:szCs w:val="28"/>
-        </w:rPr>
-      </w:pPr>
-    </w:p>
-    <w:p>
-      <w:pPr>
-        <w:pStyle w:val="Heading3"/>
-        <w:rPr>
-          <w:rFonts w:ascii="Times New Roman" w:eastAsia="Times New Roman" w:hAnsi="Times New Roman" w:cs="Times New Roman"/>
-          <w:color w:val="000000"/>
-          <w:sz w:val="28"/>
-          <w:szCs w:val="28"/>
-        </w:rPr>
-      </w:pPr>
-      <w:bookmarkStart w:id="37" w:name="_Toc158479488"/>
-      <w:r>
-        <w:rPr>
-          <w:rFonts w:ascii="Times New Roman" w:eastAsia="Times New Roman" w:hAnsi="Times New Roman" w:cs="Times New Roman"/>
-          <w:color w:val="000000"/>
-        </w:rPr>
-        <w:t>Testing and Calibration (Week 9-10):</w:t>
-      </w:r>
-      <w:bookmarkEnd w:id="37"/>
-    </w:p>
-    <w:p>
-      <w:pPr>
-        <w:rPr>
-          <w:rFonts w:ascii="Times New Roman" w:eastAsia="Times New Roman" w:hAnsi="Times New Roman" w:cs="Times New Roman"/>
-          <w:sz w:val="28"/>
-          <w:szCs w:val="28"/>
-        </w:rPr>
-      </w:pPr>
-      <w:r>
-        <w:rPr>
-          <w:rFonts w:ascii="Times New Roman" w:eastAsia="Times New Roman" w:hAnsi="Times New Roman" w:cs="Times New Roman"/>
-          <w:sz w:val="28"/>
-          <w:szCs w:val="28"/>
-        </w:rPr>
-        <w:t>Conduct initial tests to verify sensor readings, motor control, and balance performance. Fine-tune PID controller parameters through iterative testing and calibration. Evaluate the robot's ability to maintain balance under various conditions and external disturbances.</w:t>
-      </w:r>
-    </w:p>
-    <w:p>
-      <w:pPr>
-        <w:rPr>
-          <w:rFonts w:ascii="Times New Roman" w:eastAsia="Times New Roman" w:hAnsi="Times New Roman" w:cs="Times New Roman"/>
-          <w:sz w:val="28"/>
-          <w:szCs w:val="28"/>
-        </w:rPr>
-      </w:pPr>
-    </w:p>
-    <w:p>
-      <w:pPr>
-        <w:pStyle w:val="Heading3"/>
-        <w:rPr>
-          <w:rFonts w:ascii="Times New Roman" w:eastAsia="Times New Roman" w:hAnsi="Times New Roman" w:cs="Times New Roman"/>
-          <w:color w:val="000000"/>
-          <w:sz w:val="28"/>
-          <w:szCs w:val="28"/>
-        </w:rPr>
-      </w:pPr>
-      <w:bookmarkStart w:id="38" w:name="_Toc158479489"/>
-      <w:r>
-        <w:rPr>
-          <w:rFonts w:ascii="Times New Roman" w:eastAsia="Times New Roman" w:hAnsi="Times New Roman" w:cs="Times New Roman"/>
-          <w:color w:val="000000"/>
-        </w:rPr>
-        <w:t>Optimization and Refinement (Week 11-12):</w:t>
-      </w:r>
-      <w:bookmarkEnd w:id="38"/>
-    </w:p>
-    <w:p>
-      <w:pPr>
-        <w:rPr>
-          <w:rFonts w:ascii="Times New Roman" w:eastAsia="Times New Roman" w:hAnsi="Times New Roman" w:cs="Times New Roman"/>
-          <w:sz w:val="28"/>
-          <w:szCs w:val="28"/>
-        </w:rPr>
-      </w:pPr>
-      <w:r>
-        <w:rPr>
-          <w:rFonts w:ascii="Times New Roman" w:eastAsia="Times New Roman" w:hAnsi="Times New Roman" w:cs="Times New Roman"/>
-          <w:sz w:val="28"/>
-          <w:szCs w:val="28"/>
-        </w:rPr>
-        <w:t>Address any mechanical issues, hardware limitations, or software bugs identified during testing. Optimize code efficiency and performance to enhance real-time responsiveness. Document observations and modifications made during the optimization process.</w:t>
-      </w:r>
-    </w:p>
-    <w:p>
-      <w:pPr>
-        <w:rPr>
-          <w:rFonts w:ascii="Times New Roman" w:eastAsia="Times New Roman" w:hAnsi="Times New Roman" w:cs="Times New Roman"/>
-          <w:sz w:val="28"/>
-          <w:szCs w:val="28"/>
-        </w:rPr>
-      </w:pPr>
-    </w:p>
-    <w:p>
-      <w:pPr>
-        <w:pStyle w:val="Heading3"/>
-        <w:rPr>
-          <w:rFonts w:ascii="Times New Roman" w:eastAsia="Times New Roman" w:hAnsi="Times New Roman" w:cs="Times New Roman"/>
-          <w:color w:val="000000"/>
-          <w:sz w:val="28"/>
-          <w:szCs w:val="28"/>
-        </w:rPr>
-      </w:pPr>
-      <w:bookmarkStart w:id="39" w:name="_Toc158479490"/>
-      <w:r>
-        <w:rPr>
-          <w:rFonts w:ascii="Times New Roman" w:eastAsia="Times New Roman" w:hAnsi="Times New Roman" w:cs="Times New Roman"/>
-          <w:color w:val="000000"/>
-        </w:rPr>
-        <w:t>Documentation and Presentation (Week 13):</w:t>
-      </w:r>
-      <w:bookmarkEnd w:id="39"/>
-    </w:p>
-    <w:p>
-      <w:pPr>
-        <w:rPr>
-          <w:rFonts w:ascii="Times New Roman" w:eastAsia="Times New Roman" w:hAnsi="Times New Roman" w:cs="Times New Roman"/>
-          <w:sz w:val="28"/>
-          <w:szCs w:val="28"/>
-        </w:rPr>
-      </w:pPr>
-      <w:r>
-        <w:rPr>
-          <w:rFonts w:ascii="Times New Roman" w:eastAsia="Times New Roman" w:hAnsi="Times New Roman" w:cs="Times New Roman"/>
-          <w:sz w:val="28"/>
-          <w:szCs w:val="28"/>
-        </w:rPr>
-        <w:t>Document the project progress, including design choices, implementation details, and testing outcomes. Prepare written reports, presentations, or video demonstrations showcasing the self-balancing robot and its capabilities.</w:t>
-      </w:r>
-    </w:p>
-    <w:p>
-      <w:pPr>
-        <w:rPr>
-          <w:rFonts w:ascii="Times New Roman" w:eastAsia="Times New Roman" w:hAnsi="Times New Roman" w:cs="Times New Roman"/>
-          <w:sz w:val="28"/>
-          <w:szCs w:val="28"/>
-        </w:rPr>
-      </w:pPr>
-      <w:r>
-        <w:rPr>
-          <w:rFonts w:ascii="Times New Roman" w:eastAsia="Times New Roman" w:hAnsi="Times New Roman" w:cs="Times New Roman"/>
-          <w:sz w:val="28"/>
-          <w:szCs w:val="28"/>
-        </w:rPr>
-        <w:t>Share project findings and experiences with the robotics community through online forums, blogs, or social media platforms.</w:t>
-      </w:r>
-    </w:p>
-    <w:p>
-      <w:pPr>
-        <w:rPr>
-          <w:rFonts w:ascii="Times New Roman" w:eastAsia="Times New Roman" w:hAnsi="Times New Roman" w:cs="Times New Roman"/>
-          <w:sz w:val="28"/>
-          <w:szCs w:val="28"/>
-        </w:rPr>
-      </w:pPr>
-      <w:r>
-        <w:rPr>
-          <w:rFonts w:ascii="Times New Roman" w:eastAsia="Times New Roman" w:hAnsi="Times New Roman" w:cs="Times New Roman"/>
-          <w:sz w:val="28"/>
-          <w:szCs w:val="28"/>
-        </w:rPr>
-        <w:t>By breaking down the project into these milestones, we can track progress, manage tasks effectively, and ensure timely completion of the self-balancing robot project. Adjustments to the timeline may be necessary based on project complexity, resource availability, and unforeseen challenges encountered during implementation. We will make sure that any diversion in this plan is well informed and shared with the professor.</w:t>
-      </w:r>
-    </w:p>
-    <w:p>
-      <w:pPr>
-        <w:rPr>
-          <w:rFonts w:ascii="Times New Roman" w:eastAsia="Times New Roman" w:hAnsi="Times New Roman" w:cs="Times New Roman"/>
-          <w:sz w:val="28"/>
-          <w:szCs w:val="28"/>
-        </w:rPr>
-      </w:pPr>
-    </w:p>
-    <w:p>
-      <w:pPr>
-        <w:pStyle w:val="Heading2"/>
-        <w:rPr>
-          <w:rFonts w:ascii="Times New Roman" w:eastAsia="Times New Roman" w:hAnsi="Times New Roman" w:cs="Times New Roman"/>
-          <w:color w:val="000000"/>
-          <w:sz w:val="28"/>
-          <w:szCs w:val="28"/>
-        </w:rPr>
-      </w:pPr>
-      <w:bookmarkStart w:id="40" w:name="_heading=h.n1vq80k4fi3t" w:colFirst="0" w:colLast="0"/>
-      <w:bookmarkEnd w:id="40"/>
+          <w:sz w:val="28"/>
+          <w:szCs w:val="28"/>
+        </w:rPr>
+      </w:pPr>
+      <w:bookmarkStart w:id="41" w:name="_heading=h.n1vq80k4fi3t" w:colFirst="0" w:colLast="0"/>
+      <w:bookmarkEnd w:id="41"/>
     </w:p>
     <w:p/>
     <w:p/>
@@ -6537,8 +6483,8 @@
           <w:szCs w:val="28"/>
         </w:rPr>
       </w:pPr>
-      <w:bookmarkStart w:id="41" w:name="_heading=h.8zgsshphoajw" w:colFirst="0" w:colLast="0"/>
-      <w:bookmarkEnd w:id="41"/>
+      <w:bookmarkStart w:id="42" w:name="_heading=h.8zgsshphoajw" w:colFirst="0" w:colLast="0"/>
+      <w:bookmarkEnd w:id="42"/>
     </w:p>
     <w:p>
       <w:pPr>
@@ -6550,7 +6496,7 @@
           <w:szCs w:val="28"/>
         </w:rPr>
       </w:pPr>
-      <w:bookmarkStart w:id="42" w:name="_Toc158479491"/>
+      <w:bookmarkStart w:id="43" w:name="_Toc158479491"/>
       <w:r>
         <w:rPr>
           <w:rFonts w:ascii="Times New Roman" w:eastAsia="Times New Roman" w:hAnsi="Times New Roman" w:cs="Times New Roman"/>
@@ -6560,6 +6506,7 @@
         </w:rPr>
         <w:t xml:space="preserve">5. </w:t>
       </w:r>
+      <w:proofErr w:type="gramStart"/>
       <w:r>
         <w:rPr>
           <w:rFonts w:ascii="Times New Roman" w:eastAsia="Times New Roman" w:hAnsi="Times New Roman" w:cs="Times New Roman"/>
@@ -6579,11 +6526,15 @@
         </w:rPr>
         <w:t>:-</w:t>
       </w:r>
-      <w:bookmarkEnd w:id="42"/>
+      <w:bookmarkEnd w:id="43"/>
+      <w:proofErr w:type="gramEnd"/>
     </w:p>
     <w:p/>
     <w:p>
       <w:r>
+        <w:rPr>
+          <w:noProof/>
+        </w:rPr>
         <w:drawing>
           <wp:inline distT="0" distB="0" distL="0" distR="0" wp14:anchorId="0FBB6AC7" wp14:editId="62DD07FA">
             <wp:extent cx="5943600" cy="3787775"/>
@@ -6687,8 +6638,8 @@
           <w:color w:val="000000"/>
         </w:rPr>
       </w:pPr>
-      <w:bookmarkStart w:id="43" w:name="_heading=h.yqwwlqyin499" w:colFirst="0" w:colLast="0"/>
-      <w:bookmarkEnd w:id="43"/>
+      <w:bookmarkStart w:id="44" w:name="_heading=h.yqwwlqyin499" w:colFirst="0" w:colLast="0"/>
+      <w:bookmarkEnd w:id="44"/>
     </w:p>
     <w:p/>
     <w:p/>
@@ -6715,7 +6666,7 @@
           <w:szCs w:val="28"/>
         </w:rPr>
       </w:pPr>
-      <w:bookmarkStart w:id="44" w:name="_Toc158479492"/>
+      <w:bookmarkStart w:id="45" w:name="_Toc158479492"/>
       <w:r>
         <w:rPr>
           <w:rFonts w:ascii="Times New Roman" w:eastAsia="Times New Roman" w:hAnsi="Times New Roman" w:cs="Times New Roman"/>
@@ -6738,7 +6689,7 @@
         </w:rPr>
         <w:t>: -</w:t>
       </w:r>
-      <w:bookmarkEnd w:id="44"/>
+      <w:bookmarkEnd w:id="45"/>
     </w:p>
     <w:p>
       <w:pPr>
@@ -7103,29 +7054,29 @@
           <w:color w:val="000000"/>
         </w:rPr>
       </w:pPr>
-      <w:bookmarkStart w:id="45" w:name="_heading=h.3zrdhd6zyp0c" w:colFirst="0" w:colLast="0"/>
-      <w:bookmarkEnd w:id="45"/>
-    </w:p>
-    <w:p>
-      <w:pPr>
-        <w:rPr>
-          <w:rFonts w:ascii="Times New Roman" w:eastAsia="Times New Roman" w:hAnsi="Times New Roman" w:cs="Times New Roman"/>
-        </w:rPr>
-      </w:pPr>
-    </w:p>
-    <w:p>
-      <w:bookmarkStart w:id="46" w:name="_heading=h.8q26ebnnokao" w:colFirst="0" w:colLast="0"/>
+      <w:bookmarkStart w:id="46" w:name="_heading=h.3zrdhd6zyp0c" w:colFirst="0" w:colLast="0"/>
       <w:bookmarkEnd w:id="46"/>
     </w:p>
     <w:p>
       <w:pPr>
+        <w:rPr>
+          <w:rFonts w:ascii="Times New Roman" w:eastAsia="Times New Roman" w:hAnsi="Times New Roman" w:cs="Times New Roman"/>
+        </w:rPr>
+      </w:pPr>
+    </w:p>
+    <w:p>
+      <w:bookmarkStart w:id="47" w:name="_heading=h.8q26ebnnokao" w:colFirst="0" w:colLast="0"/>
+      <w:bookmarkEnd w:id="47"/>
+    </w:p>
+    <w:p>
+      <w:pPr>
         <w:pStyle w:val="Heading1"/>
         <w:rPr>
           <w:rFonts w:ascii="Times New Roman" w:eastAsia="Times New Roman" w:hAnsi="Times New Roman" w:cs="Times New Roman"/>
           <w:color w:val="000000"/>
         </w:rPr>
       </w:pPr>
-      <w:bookmarkStart w:id="47" w:name="_Toc158479493"/>
+      <w:bookmarkStart w:id="48" w:name="_Toc158479493"/>
       <w:r>
         <w:rPr>
           <w:rFonts w:ascii="Times New Roman" w:eastAsia="Times New Roman" w:hAnsi="Times New Roman" w:cs="Times New Roman"/>
@@ -7134,7 +7085,7 @@
         <w:lastRenderedPageBreak/>
         <w:t>Facilities and Resources:</w:t>
       </w:r>
-      <w:bookmarkEnd w:id="47"/>
+      <w:bookmarkEnd w:id="48"/>
     </w:p>
     <w:p>
       <w:pPr>
@@ -7601,7 +7552,7 @@
           <w:color w:val="000000"/>
         </w:rPr>
       </w:pPr>
-      <w:bookmarkStart w:id="48" w:name="_Toc158479494"/>
+      <w:bookmarkStart w:id="49" w:name="_Toc158479494"/>
       <w:r>
         <w:rPr>
           <w:rFonts w:ascii="Times New Roman" w:eastAsia="Times New Roman" w:hAnsi="Times New Roman" w:cs="Times New Roman"/>
@@ -7610,7 +7561,7 @@
         <w:lastRenderedPageBreak/>
         <w:t>Budget:</w:t>
       </w:r>
-      <w:bookmarkEnd w:id="48"/>
+      <w:bookmarkEnd w:id="49"/>
     </w:p>
     <w:p>
       <w:pPr>
@@ -7897,7 +7848,7 @@
           <w:color w:val="000000"/>
         </w:rPr>
       </w:pPr>
-      <w:bookmarkStart w:id="49" w:name="_Toc158479495"/>
+      <w:bookmarkStart w:id="50" w:name="_Toc158479495"/>
       <w:r>
         <w:rPr>
           <w:rFonts w:ascii="Times New Roman" w:eastAsia="Times New Roman" w:hAnsi="Times New Roman" w:cs="Times New Roman"/>
@@ -7906,7 +7857,7 @@
         <w:lastRenderedPageBreak/>
         <w:t>References:</w:t>
       </w:r>
-      <w:bookmarkEnd w:id="49"/>
+      <w:bookmarkEnd w:id="50"/>
       <w:r>
         <w:rPr>
           <w:rFonts w:ascii="Times New Roman" w:eastAsia="Times New Roman" w:hAnsi="Times New Roman" w:cs="Times New Roman"/>
@@ -7981,7 +7932,25 @@
           <w:sz w:val="24"/>
           <w:szCs w:val="24"/>
         </w:rPr>
-        <w:t>Khan, Muhammad rafa. “Speed Control of DC Motor under Varying Load Using PID Controller.” </w:t>
+        <w:t xml:space="preserve">Khan, Muhammad </w:t>
+      </w:r>
+      <w:proofErr w:type="spellStart"/>
+      <w:r>
+        <w:rPr>
+          <w:rFonts w:ascii="Times New Roman" w:eastAsia="Times New Roman" w:hAnsi="Times New Roman" w:cs="Times New Roman"/>
+          <w:sz w:val="24"/>
+          <w:szCs w:val="24"/>
+        </w:rPr>
+        <w:t>rafa</w:t>
+      </w:r>
+      <w:proofErr w:type="spellEnd"/>
+      <w:r>
+        <w:rPr>
+          <w:rFonts w:ascii="Times New Roman" w:eastAsia="Times New Roman" w:hAnsi="Times New Roman" w:cs="Times New Roman"/>
+          <w:sz w:val="24"/>
+          <w:szCs w:val="24"/>
+        </w:rPr>
+        <w:t>. “Speed Control of DC Motor under Varying Load Using PID Controller.” </w:t>
       </w:r>
       <w:r>
         <w:rPr>
@@ -8024,7 +7993,43 @@
           <w:sz w:val="24"/>
           <w:szCs w:val="24"/>
         </w:rPr>
-        <w:t>Jain, Hardik S, Sandesh Agrawal, and krishnman Tibrewal. “DC Motor Speed Control Using PID Controller, IR Sensor and PWM Hysteresis .” </w:t>
+        <w:t xml:space="preserve">Jain, Hardik S, Sandesh Agrawal, and </w:t>
+      </w:r>
+      <w:proofErr w:type="spellStart"/>
+      <w:r>
+        <w:rPr>
+          <w:rFonts w:ascii="Times New Roman" w:eastAsia="Times New Roman" w:hAnsi="Times New Roman" w:cs="Times New Roman"/>
+          <w:sz w:val="24"/>
+          <w:szCs w:val="24"/>
+        </w:rPr>
+        <w:t>krishnman</w:t>
+      </w:r>
+      <w:proofErr w:type="spellEnd"/>
+      <w:r>
+        <w:rPr>
+          <w:rFonts w:ascii="Times New Roman" w:eastAsia="Times New Roman" w:hAnsi="Times New Roman" w:cs="Times New Roman"/>
+          <w:sz w:val="24"/>
+          <w:szCs w:val="24"/>
+        </w:rPr>
+        <w:t xml:space="preserve"> Tibrewal. “DC Motor Speed Control Using PID Controller, IR Sensor and PWM </w:t>
+      </w:r>
+      <w:proofErr w:type="gramStart"/>
+      <w:r>
+        <w:rPr>
+          <w:rFonts w:ascii="Times New Roman" w:eastAsia="Times New Roman" w:hAnsi="Times New Roman" w:cs="Times New Roman"/>
+          <w:sz w:val="24"/>
+          <w:szCs w:val="24"/>
+        </w:rPr>
+        <w:t>Hysteresis .</w:t>
+      </w:r>
+      <w:proofErr w:type="gramEnd"/>
+      <w:r>
+        <w:rPr>
+          <w:rFonts w:ascii="Times New Roman" w:eastAsia="Times New Roman" w:hAnsi="Times New Roman" w:cs="Times New Roman"/>
+          <w:sz w:val="24"/>
+          <w:szCs w:val="24"/>
+        </w:rPr>
+        <w:t>” </w:t>
       </w:r>
       <w:r>
         <w:rPr>
@@ -8067,7 +8072,25 @@
           <w:sz w:val="24"/>
           <w:szCs w:val="24"/>
         </w:rPr>
-        <w:t>Juang, H. S., &amp; Lum, K. Y. (2013, June). Design and control of a two-wheel self-balancing robot using the arduino microcontroller board. In 2013 10th IEEE International Conference on Control and Automation (ICCA) (pp. 634-639). IEEE.</w:t>
+        <w:t xml:space="preserve">Juang, H. S., &amp; Lum, K. Y. (2013, June). Design and control of a two-wheel self-balancing robot using the </w:t>
+      </w:r>
+      <w:proofErr w:type="spellStart"/>
+      <w:r>
+        <w:rPr>
+          <w:rFonts w:ascii="Times New Roman" w:eastAsia="Times New Roman" w:hAnsi="Times New Roman" w:cs="Times New Roman"/>
+          <w:sz w:val="24"/>
+          <w:szCs w:val="24"/>
+        </w:rPr>
+        <w:t>arduino</w:t>
+      </w:r>
+      <w:proofErr w:type="spellEnd"/>
+      <w:r>
+        <w:rPr>
+          <w:rFonts w:ascii="Times New Roman" w:eastAsia="Times New Roman" w:hAnsi="Times New Roman" w:cs="Times New Roman"/>
+          <w:sz w:val="24"/>
+          <w:szCs w:val="24"/>
+        </w:rPr>
+        <w:t xml:space="preserve"> microcontroller board. In 2013 10th IEEE International Conference on Control and Automation (ICCA) (pp. 634-639). IEEE.</w:t>
       </w:r>
     </w:p>
     <w:p>
@@ -8087,13 +8110,23 @@
           <w:szCs w:val="24"/>
         </w:rPr>
       </w:pPr>
-      <w:r>
-        <w:rPr>
-          <w:rFonts w:ascii="Times New Roman" w:eastAsia="Times New Roman" w:hAnsi="Times New Roman" w:cs="Times New Roman"/>
-          <w:sz w:val="24"/>
-          <w:szCs w:val="24"/>
-        </w:rPr>
-        <w:t>An, W., &amp; Li, Y. (2013, December). Simulation and control of a two-wheeled self-balancing robot. In 2013 IEEE International Conference on Robotics and Biomimetics (ROBIO) (pp. 456-461). IEEE.</w:t>
+      <w:proofErr w:type="gramStart"/>
+      <w:r>
+        <w:rPr>
+          <w:rFonts w:ascii="Times New Roman" w:eastAsia="Times New Roman" w:hAnsi="Times New Roman" w:cs="Times New Roman"/>
+          <w:sz w:val="24"/>
+          <w:szCs w:val="24"/>
+        </w:rPr>
+        <w:t>An,</w:t>
+      </w:r>
+      <w:proofErr w:type="gramEnd"/>
+      <w:r>
+        <w:rPr>
+          <w:rFonts w:ascii="Times New Roman" w:eastAsia="Times New Roman" w:hAnsi="Times New Roman" w:cs="Times New Roman"/>
+          <w:sz w:val="24"/>
+          <w:szCs w:val="24"/>
+        </w:rPr>
+        <w:t xml:space="preserve"> W., &amp; Li, Y. (2013, December). Simulation and control of a two-wheeled self-balancing robot. In 2013 IEEE International Conference on Robotics and Biomimetics (ROBIO) (pp. 456-461). IEEE.</w:t>
       </w:r>
     </w:p>
     <w:p>
@@ -8119,7 +8152,43 @@
           <w:sz w:val="24"/>
           <w:szCs w:val="24"/>
         </w:rPr>
-        <w:t>Hegde, S. S., Chakole, S., &amp; Vora, V. (2017). Development of self balancing robot with pid control. International Journal of Robotics Research and Development (IJRRD), 7(1), 1-6.</w:t>
+        <w:t xml:space="preserve">Hegde, S. S., Chakole, S., &amp; Vora, V. (2017). Development of </w:t>
+      </w:r>
+      <w:proofErr w:type="spellStart"/>
+      <w:r>
+        <w:rPr>
+          <w:rFonts w:ascii="Times New Roman" w:eastAsia="Times New Roman" w:hAnsi="Times New Roman" w:cs="Times New Roman"/>
+          <w:sz w:val="24"/>
+          <w:szCs w:val="24"/>
+        </w:rPr>
+        <w:t>self balancing</w:t>
+      </w:r>
+      <w:proofErr w:type="spellEnd"/>
+      <w:r>
+        <w:rPr>
+          <w:rFonts w:ascii="Times New Roman" w:eastAsia="Times New Roman" w:hAnsi="Times New Roman" w:cs="Times New Roman"/>
+          <w:sz w:val="24"/>
+          <w:szCs w:val="24"/>
+        </w:rPr>
+        <w:t xml:space="preserve"> robot with </w:t>
+      </w:r>
+      <w:proofErr w:type="spellStart"/>
+      <w:r>
+        <w:rPr>
+          <w:rFonts w:ascii="Times New Roman" w:eastAsia="Times New Roman" w:hAnsi="Times New Roman" w:cs="Times New Roman"/>
+          <w:sz w:val="24"/>
+          <w:szCs w:val="24"/>
+        </w:rPr>
+        <w:t>pid</w:t>
+      </w:r>
+      <w:proofErr w:type="spellEnd"/>
+      <w:r>
+        <w:rPr>
+          <w:rFonts w:ascii="Times New Roman" w:eastAsia="Times New Roman" w:hAnsi="Times New Roman" w:cs="Times New Roman"/>
+          <w:sz w:val="24"/>
+          <w:szCs w:val="24"/>
+        </w:rPr>
+        <w:t xml:space="preserve"> control. International Journal of Robotics Research and Development (IJRRD), 7(1), 1-6.</w:t>
       </w:r>
     </w:p>
     <w:p>
@@ -10092,28 +10161,28 @@
 </file>
 
 <file path=customXml/item1.xml><?xml version="1.0" encoding="utf-8"?>
+<b:Sources xmlns:b="http://schemas.openxmlformats.org/officeDocument/2006/bibliography" xmlns="http://schemas.openxmlformats.org/officeDocument/2006/bibliography" SelectedStyle="\APASixthEditionOfficeOnline.xsl" StyleName="APA" Version="6"/>
+</file>
+
+<file path=customXml/item2.xml><?xml version="1.0" encoding="utf-8"?>
 <go:gDocsCustomXmlDataStorage xmlns:go="http://customooxmlschemas.google.com/" xmlns:r="http://schemas.openxmlformats.org/officeDocument/2006/relationships" uri="GoogleDocsCustomDataVersion2">
   <go:docsCustomData xmlns:go="http://customooxmlschemas.google.com/" roundtripDataSignature="AMtx7mgDI/u1UksxA9Kkxmj4wr6rkNberg==">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</go:docsCustomData>
 </go:gDocsCustomXmlDataStorage>
 </file>
 
-<file path=customXml/item2.xml><?xml version="1.0" encoding="utf-8"?>
-<b:Sources xmlns:b="http://schemas.openxmlformats.org/officeDocument/2006/bibliography" xmlns="http://schemas.openxmlformats.org/officeDocument/2006/bibliography" SelectedStyle="\APASixthEditionOfficeOnline.xsl" StyleName="APA" Version="6"/>
+<file path=customXml/itemProps1.xml><?xml version="1.0" encoding="utf-8"?>
+<ds:datastoreItem xmlns:ds="http://schemas.openxmlformats.org/officeDocument/2006/customXml" ds:itemID="{207849BA-3285-4390-86D9-6B48E2BF5D21}">
+  <ds:schemaRefs>
+    <ds:schemaRef ds:uri="http://schemas.openxmlformats.org/officeDocument/2006/bibliography"/>
+  </ds:schemaRefs>
+</ds:datastoreItem>
 </file>
 
-<file path=customXml/itemProps1.xml><?xml version="1.0" encoding="utf-8"?>
+<file path=customXml/itemProps2.xml><?xml version="1.0" encoding="utf-8"?>
 <ds:datastoreItem xmlns:ds="http://schemas.openxmlformats.org/officeDocument/2006/customXml" ds:itemID="{11111111-1234-1234-1234-123412341234}">
   <ds:schemaRefs>
     <ds:schemaRef ds:uri="http://customooxmlschemas.google.com/"/>
     <ds:schemaRef ds:uri="http://schemas.openxmlformats.org/officeDocument/2006/relationships"/>
   </ds:schemaRefs>
 </ds:datastoreItem>
-</file>
-
-<file path=customXml/itemProps2.xml><?xml version="1.0" encoding="utf-8"?>
-<ds:datastoreItem xmlns:ds="http://schemas.openxmlformats.org/officeDocument/2006/customXml" ds:itemID="{207849BA-3285-4390-86D9-6B48E2BF5D21}">
-  <ds:schemaRefs>
-    <ds:schemaRef ds:uri="http://schemas.openxmlformats.org/officeDocument/2006/bibliography"/>
-  </ds:schemaRefs>
-</ds:datastoreItem>
 </file>
</xml_diff>